<commit_message>
feat(certificados): aprimora emissao e modelos em lote
</commit_message>
<xml_diff>
--- a/cursos/Curso de Formação de Brigada Orgânica.docx
+++ b/cursos/Curso de Formação de Brigada Orgânica.docx
@@ -462,7 +462,24 @@
           <w:sz w:val="32"/>
           <w:szCs w:val="32"/>
         </w:rPr>
-        <w:t>Carlos Alexandre R.  Faria                                                                           __________________________                                                                                                         Reg.MTE0056818/MG                                                                                                        Aluno                                                                                                                                                                                                                                                                                                                               Coren MG 001.312.974                                                                                                                                                                                        Reg.  CBMMG Nº F 0004348</w:t>
+        <w:t xml:space="preserve">Carlos Alexandre R.  Faria                                                                           __________________________                                                                                                         Reg.MTE0056818/MG                                                                                                        </w:t>
+      </w:r>
+      <w:r>
+        <w:rPr>
+          <w:rFonts w:hint="default" w:ascii="Arial" w:hAnsi="Arial" w:eastAsia="Corsiva" w:cs="Arial"/>
+          <w:sz w:val="32"/>
+          <w:szCs w:val="32"/>
+          <w:lang w:val="pt-BR"/>
+        </w:rPr>
+        <w:t>{{nome}}</w:t>
+      </w:r>
+      <w:r>
+        <w:rPr>
+          <w:rFonts w:ascii="Arial" w:hAnsi="Arial" w:eastAsia="Corsiva" w:cs="Arial"/>
+          <w:sz w:val="32"/>
+          <w:szCs w:val="32"/>
+        </w:rPr>
+        <w:t xml:space="preserve">                                                                                                                                                                                                                                                                                                                               Coren MG 001.312.974                                                                                                                                                                                        Reg.  CBMMG Nº F 0004348</w:t>
       </w:r>
     </w:p>
     <w:p>
@@ -518,7 +535,26 @@
           <w:sz w:val="36"/>
           <w:szCs w:val="36"/>
         </w:rPr>
-        <w:t>Carga horária 08 hrs</w:t>
+        <w:t xml:space="preserve">Carga horária </w:t>
+      </w:r>
+      <w:r>
+        <w:rPr>
+          <w:rFonts w:hint="default" w:ascii="Arial" w:hAnsi="Arial" w:eastAsia="Corsiva" w:cs="Arial"/>
+          <w:b/>
+          <w:sz w:val="36"/>
+          <w:szCs w:val="36"/>
+          <w:lang w:val="pt-BR"/>
+        </w:rPr>
+        <w:t>{{horas}}</w:t>
+      </w:r>
+      <w:r>
+        <w:rPr>
+          <w:rFonts w:ascii="Arial" w:hAnsi="Arial" w:eastAsia="Corsiva" w:cs="Arial"/>
+          <w:b/>
+          <w:sz w:val="36"/>
+          <w:szCs w:val="36"/>
+        </w:rPr>
+        <w:t xml:space="preserve"> hrs</w:t>
       </w:r>
     </w:p>
     <w:tbl>
@@ -959,19 +995,21 @@
             <w:pPr>
               <w:spacing w:after="0" w:line="240" w:lineRule="auto"/>
               <w:rPr>
-                <w:rFonts w:ascii="Arial" w:hAnsi="Arial" w:eastAsia="Corsiva" w:cs="Arial"/>
-                <w:sz w:val="18"/>
-                <w:szCs w:val="18"/>
-              </w:rPr>
-            </w:pPr>
-            <w:r>
-              <w:rPr>
-                <w:rFonts w:ascii="Arial" w:hAnsi="Arial" w:eastAsia="Corsiva" w:cs="Arial"/>
+                <w:rFonts w:hint="default" w:ascii="Arial" w:hAnsi="Arial" w:eastAsia="Corsiva" w:cs="Arial"/>
+                <w:sz w:val="18"/>
+                <w:szCs w:val="18"/>
+                <w:lang w:val="pt-BR"/>
+              </w:rPr>
+            </w:pPr>
+            <w:r>
+              <w:rPr>
+                <w:rFonts w:hint="default" w:ascii="Arial" w:hAnsi="Arial" w:eastAsia="Corsiva" w:cs="Arial"/>
                 <w:b/>
                 <w:sz w:val="24"/>
                 <w:szCs w:val="24"/>
-              </w:rPr>
-              <w:t>4:00</w:t>
+                <w:lang w:val="pt-BR"/>
+              </w:rPr>
+              <w:t>{{HORAS_CI}}</w:t>
             </w:r>
           </w:p>
         </w:tc>
@@ -1131,21 +1169,25 @@
             <w:pPr>
               <w:spacing w:after="0" w:line="240" w:lineRule="auto"/>
               <w:rPr>
-                <w:rFonts w:ascii="Arial" w:hAnsi="Arial" w:eastAsia="Corsiva" w:cs="Arial"/>
+                <w:rFonts w:hint="default" w:ascii="Arial" w:hAnsi="Arial" w:eastAsia="Corsiva" w:cs="Arial"/>
                 <w:b/>
                 <w:sz w:val="24"/>
                 <w:szCs w:val="24"/>
-              </w:rPr>
-            </w:pPr>
-            <w:r>
-              <w:rPr>
-                <w:rFonts w:ascii="Arial" w:hAnsi="Arial" w:eastAsia="Corsiva" w:cs="Arial"/>
+                <w:lang w:val="pt-BR"/>
+              </w:rPr>
+            </w:pPr>
+            <w:r>
+              <w:rPr>
+                <w:rFonts w:hint="default" w:ascii="Arial" w:hAnsi="Arial" w:eastAsia="Corsiva" w:cs="Arial"/>
                 <w:b/>
                 <w:sz w:val="24"/>
                 <w:szCs w:val="24"/>
-              </w:rPr>
-              <w:t>4:00</w:t>
-            </w:r>
+                <w:lang w:val="pt-BR"/>
+              </w:rPr>
+              <w:t>{{HORAS_PS}}</w:t>
+            </w:r>
+            <w:bookmarkStart w:id="0" w:name="_GoBack"/>
+            <w:bookmarkEnd w:id="0"/>
           </w:p>
         </w:tc>
       </w:tr>
@@ -3380,8 +3422,6 @@
         </w:rPr>
         <w:t xml:space="preserve"> Numeração - {{COD}}</w:t>
       </w:r>
-      <w:bookmarkStart w:id="0" w:name="_GoBack"/>
-      <w:bookmarkEnd w:id="0"/>
     </w:p>
     <w:sectPr>
       <w:headerReference r:id="rId7" w:type="first"/>
@@ -3655,7 +3695,7 @@
     <w:lsdException w:qFormat="1" w:unhideWhenUsed="0" w:uiPriority="10" w:semiHidden="0" w:name="Title"/>
     <w:lsdException w:uiPriority="99" w:name="Closing"/>
     <w:lsdException w:uiPriority="99" w:name="Signature"/>
-    <w:lsdException w:uiPriority="1" w:name="Default Paragraph Font"/>
+    <w:lsdException w:qFormat="1" w:uiPriority="1" w:name="Default Paragraph Font"/>
     <w:lsdException w:uiPriority="99" w:name="Body Text"/>
     <w:lsdException w:uiPriority="99" w:name="Body Text Indent"/>
     <w:lsdException w:uiPriority="99" w:name="List Continue"/>
@@ -3875,6 +3915,7 @@
     <w:name w:val="Default Paragraph Font"/>
     <w:semiHidden/>
     <w:unhideWhenUsed/>
+    <w:qFormat/>
     <w:uiPriority w:val="1"/>
   </w:style>
   <w:style w:type="table" w:default="1" w:styleId="9">

</xml_diff>